<commit_message>
Update abdomen-pelvis content and flashcards
</commit_message>
<xml_diff>
--- a/www/content/abdomen-pelvis/Celiac trunk.docx
+++ b/www/content/abdomen-pelvis/Celiac trunk.docx
@@ -41,10 +41,7 @@
     </w:p>
     <w:p>
       <w:r>
-        <w:t>[TIP]</w:t>
-      </w:r>
-      <w:r>
-        <w:t>Development: The celiac trunk appears in the fifth week of embryonic development at the level of the seventh cervical segment</w:t>
+        <w:t>[TIP]Development: The celiac trunk appears in the fifth week of embryonic development at the level of the seventh cervical segment</w:t>
       </w:r>
     </w:p>
     <w:p>
@@ -64,10 +61,7 @@
         </w:numPr>
       </w:pPr>
       <w:r>
-        <w:t>At</w:t>
-      </w:r>
-      <w:r>
-        <w:t xml:space="preserve"> the lower third of the first lumbar vertebra</w:t>
+        <w:t>At the lower third of the first lumbar vertebra</w:t>
       </w:r>
     </w:p>
     <w:p>
@@ -87,10 +81,7 @@
         </w:numPr>
       </w:pPr>
       <w:r>
-        <w:t>P</w:t>
-      </w:r>
-      <w:r>
-        <w:t>asses in front of the aorta at the level of the first lumbar vertebra, usually just above the origin of the celiac trunk</w:t>
+        <w:t>Passes in front of the aorta at the level of the first lumbar vertebra, usually just above the origin of the celiac trunk</w:t>
       </w:r>
     </w:p>
     <w:p>
@@ -116,33 +107,18 @@
     <w:p>
       <w:pPr>
         <w:pStyle w:val="ListParagraph"/>
+        <w:ind w:left="0"/>
       </w:pPr>
       <w:r>
         <w:rPr>
           <w:noProof/>
-          <w:lang w:eastAsia="en-IN"/>
+          <w14:ligatures w14:val="standardContextual"/>
         </w:rPr>
         <w:drawing>
-          <wp:anchor distT="0" distB="0" distL="114300" distR="114300" simplePos="0" relativeHeight="251659264" behindDoc="0" locked="0" layoutInCell="1" allowOverlap="1" wp14:anchorId="3D97B0C8" wp14:editId="7F65C2B7">
-            <wp:simplePos x="0" y="0"/>
-            <wp:positionH relativeFrom="column">
-              <wp:posOffset>-76200</wp:posOffset>
-            </wp:positionH>
-            <wp:positionV relativeFrom="paragraph">
-              <wp:posOffset>89535</wp:posOffset>
-            </wp:positionV>
-            <wp:extent cx="3332480" cy="4362450"/>
-            <wp:effectExtent l="0" t="0" r="1270" b="0"/>
-            <wp:wrapThrough wrapText="bothSides">
-              <wp:wrapPolygon edited="0">
-                <wp:start x="0" y="0"/>
-                <wp:lineTo x="0" y="21506"/>
-                <wp:lineTo x="21485" y="21506"/>
-                <wp:lineTo x="21485" y="0"/>
-                <wp:lineTo x="0" y="0"/>
-              </wp:wrapPolygon>
-            </wp:wrapThrough>
-            <wp:docPr id="43" name="Picture 43"/>
+          <wp:inline distT="0" distB="0" distL="0" distR="0" wp14:anchorId="2E03904B" wp14:editId="51F178EF">
+            <wp:extent cx="5731510" cy="4460240"/>
+            <wp:effectExtent l="0" t="0" r="0" b="0"/>
+            <wp:docPr id="1900293502" name="Graphic 1"/>
             <wp:cNvGraphicFramePr>
               <a:graphicFrameLocks xmlns:a="http://schemas.openxmlformats.org/drawingml/2006/main" noChangeAspect="1"/>
             </wp:cNvGraphicFramePr>
@@ -150,14 +126,14 @@
               <a:graphicData uri="http://schemas.openxmlformats.org/drawingml/2006/picture">
                 <pic:pic xmlns:pic="http://schemas.openxmlformats.org/drawingml/2006/picture">
                   <pic:nvPicPr>
-                    <pic:cNvPr id="1" name=""/>
+                    <pic:cNvPr id="1900293502" name=""/>
                     <pic:cNvPicPr/>
                   </pic:nvPicPr>
                   <pic:blipFill>
                     <a:blip r:embed="rId5">
                       <a:extLst>
-                        <a:ext uri="{28A0092B-C50C-407E-A947-70E740481C1C}">
-                          <a14:useLocalDpi xmlns:a14="http://schemas.microsoft.com/office/drawing/2010/main" val="0"/>
+                        <a:ext uri="{96DAC541-7B7A-43D3-8B79-37D633B846F1}">
+                          <asvg:svgBlip xmlns:asvg="http://schemas.microsoft.com/office/drawing/2016/SVG/main" r:embed="rId6"/>
                         </a:ext>
                       </a:extLst>
                     </a:blip>
@@ -168,7 +144,7 @@
                   <pic:spPr>
                     <a:xfrm>
                       <a:off x="0" y="0"/>
-                      <a:ext cx="3332480" cy="4362450"/>
+                      <a:ext cx="5731510" cy="4460240"/>
                     </a:xfrm>
                     <a:prstGeom prst="rect">
                       <a:avLst/>
@@ -177,13 +153,7 @@
                 </pic:pic>
               </a:graphicData>
             </a:graphic>
-            <wp14:sizeRelH relativeFrom="margin">
-              <wp14:pctWidth>0</wp14:pctWidth>
-            </wp14:sizeRelH>
-            <wp14:sizeRelV relativeFrom="margin">
-              <wp14:pctHeight>0</wp14:pctHeight>
-            </wp14:sizeRelV>
-          </wp:anchor>
+          </wp:inline>
         </w:drawing>
       </w:r>
     </w:p>
@@ -216,6 +186,7 @@
         </w:numPr>
       </w:pPr>
       <w:r>
+        <w:lastRenderedPageBreak/>
         <w:t>Splenic artery</w:t>
       </w:r>
     </w:p>
@@ -283,11 +254,7 @@
     <w:p/>
     <w:p>
       <w:r>
-        <w:lastRenderedPageBreak/>
-        <w:t>[CLINICAL]</w:t>
-      </w:r>
-      <w:r>
-        <w:t>Celiac artery compression syndrome: mostly by the median arcuate ligament</w:t>
+        <w:t>[CLINICAL]Celiac artery compression syndrome: mostly by the median arcuate ligament</w:t>
       </w:r>
     </w:p>
     <w:sectPr>

</xml_diff>